<commit_message>
Add competency levels page and official competency numbers in SBA tools
- New page: English Competencies and Competency Levels by Grade (6 to 11),
  transcribed per grade from the NIE English Language Teachers' Guides
  (tools/ppp/competencies.js), with Word and PDF downloads
- Seven English SBA tools now carry the official competency and level numbers
- Linked from the hub, the menu, the annual plan templates and the SBA page

Co-Authored-By: Claude Opus 5 <noreply@anthropic.com>
</commit_message>
<xml_diff>
--- a/assets/downloads/teacher/rcf-english-annual-term-plan-templates.docx
+++ b/assets/downloads/teacher/rcf-english-annual-term-plan-templates.docx
@@ -32,7 +32,19 @@
         <w:pStyle w:val="Note"/>
       </w:pPr>
       <w:r>
-        <w:t xml:space="preserve">Copy the headings into your record book or print this page. The units are listed in the order of each grade's Pupil's Book. </w:t>
+        <w:t xml:space="preserve">Copy the headings into your record book or print this page. For the Competencies column, see </w:t>
+      </w:r>
+      <w:r>
+        <w:t xml:space="preserve">English Competencies and Competency Levels by Grade</w:t>
+      </w:r>
+      <w:r>
+        <w:rPr>
+          <w:sz w:val="18"/>
+        </w:rPr>
+        <w:t xml:space="preserve"> (https://rcfenglish.com/teacher-resources/competency-levels/)</w:t>
+      </w:r>
+      <w:r>
+        <w:t xml:space="preserve">. The units are listed in the order of each grade's Pupil's Book. </w:t>
       </w:r>
       <w:r>
         <w:rPr>

</xml_diff>

<commit_message>
Add official book and guide links page, and Grade 4 PPP lesson plans
- New page: English Pupil's Books, Workbooks and Teachers' Guides, linking
  every free book on edupub.gov.lk and every English guide on nie.lk
  (68 links, all checked; re-check with tools/ppp/check-book-links.js)
- 15 Grade 4 plans from the Grade 4 Pupil's Book supplied by the owner,
  so the set is now 113 plans; Grade 4 added to the planning templates
- Percent-encode brackets in book URLs: a bare ")" ended markdown links early
- Linked from the Teacher Resources hub and the menu

Co-Authored-By: Claude Opus 5 <noreply@anthropic.com>
</commit_message>
<xml_diff>
--- a/assets/downloads/teacher/rcf-english-annual-term-plan-templates.docx
+++ b/assets/downloads/teacher/rcf-english-annual-term-plan-templates.docx
@@ -2481,7 +2481,7 @@
         <w:keepNext/>
       </w:pPr>
       <w:r>
-        <w:t xml:space="preserve">We do not have the Grade 4 book yet, so the units are not listed. Copy them from your Grade 4 Teacher's Guide or Pupil's Book into the blank rows.</w:t>
+        <w:t xml:space="preserve">Units from the Grade 4 English Pupil's Book.</w:t>
       </w:r>
     </w:p>
     <w:tbl>
@@ -2631,490 +2631,628 @@
               <w:pStyle w:val="TableText"/>
             </w:pPr>
             <w:r>
-              <w:t xml:space="preserve">Unit 1:</w:t>
-            </w:r>
-          </w:p>
-        </w:tc>
-        <w:tc>
-          <w:tcPr>
-            <w:tcW w:w="2506" w:type="dxa"/>
-          </w:tcPr>
-          <w:p>
-            <w:pPr>
-              <w:pStyle w:val="TableText"/>
-            </w:pPr>
-          </w:p>
-        </w:tc>
-        <w:tc>
-          <w:tcPr>
-            <w:tcW w:w="2506" w:type="dxa"/>
-          </w:tcPr>
-          <w:p>
-            <w:pPr>
-              <w:pStyle w:val="TableText"/>
-            </w:pPr>
-          </w:p>
-        </w:tc>
-        <w:tc>
-          <w:tcPr>
-            <w:tcW w:w="2506" w:type="dxa"/>
-          </w:tcPr>
-          <w:p>
-            <w:pPr>
-              <w:pStyle w:val="TableText"/>
-            </w:pPr>
-          </w:p>
-        </w:tc>
-        <w:tc>
-          <w:tcPr>
-            <w:tcW w:w="2506" w:type="dxa"/>
-          </w:tcPr>
-          <w:p>
-            <w:pPr>
-              <w:pStyle w:val="TableText"/>
-            </w:pPr>
-          </w:p>
-        </w:tc>
-        <w:tc>
-          <w:tcPr>
-            <w:tcW w:w="2508" w:type="dxa"/>
-          </w:tcPr>
-          <w:p>
-            <w:pPr>
-              <w:pStyle w:val="TableText"/>
-            </w:pPr>
-          </w:p>
-        </w:tc>
-      </w:tr>
-      <w:tr>
-        <w:trPr>
-          <w:cantSplit/>
-          <w:trHeight w:val="700"/>
-        </w:trPr>
-        <w:tc>
-          <w:tcPr>
-            <w:tcW w:w="2506" w:type="dxa"/>
-          </w:tcPr>
-          <w:p>
-            <w:pPr>
-              <w:pStyle w:val="TableText"/>
-            </w:pPr>
-            <w:r>
-              <w:t xml:space="preserve">Unit 2:</w:t>
-            </w:r>
-          </w:p>
-        </w:tc>
-        <w:tc>
-          <w:tcPr>
-            <w:tcW w:w="2506" w:type="dxa"/>
-          </w:tcPr>
-          <w:p>
-            <w:pPr>
-              <w:pStyle w:val="TableText"/>
-            </w:pPr>
-          </w:p>
-        </w:tc>
-        <w:tc>
-          <w:tcPr>
-            <w:tcW w:w="2506" w:type="dxa"/>
-          </w:tcPr>
-          <w:p>
-            <w:pPr>
-              <w:pStyle w:val="TableText"/>
-            </w:pPr>
-          </w:p>
-        </w:tc>
-        <w:tc>
-          <w:tcPr>
-            <w:tcW w:w="2506" w:type="dxa"/>
-          </w:tcPr>
-          <w:p>
-            <w:pPr>
-              <w:pStyle w:val="TableText"/>
-            </w:pPr>
-          </w:p>
-        </w:tc>
-        <w:tc>
-          <w:tcPr>
-            <w:tcW w:w="2506" w:type="dxa"/>
-          </w:tcPr>
-          <w:p>
-            <w:pPr>
-              <w:pStyle w:val="TableText"/>
-            </w:pPr>
-          </w:p>
-        </w:tc>
-        <w:tc>
-          <w:tcPr>
-            <w:tcW w:w="2508" w:type="dxa"/>
-          </w:tcPr>
-          <w:p>
-            <w:pPr>
-              <w:pStyle w:val="TableText"/>
-            </w:pPr>
-          </w:p>
-        </w:tc>
-      </w:tr>
-      <w:tr>
-        <w:trPr>
-          <w:cantSplit/>
-          <w:trHeight w:val="700"/>
-        </w:trPr>
-        <w:tc>
-          <w:tcPr>
-            <w:tcW w:w="2506" w:type="dxa"/>
-          </w:tcPr>
-          <w:p>
-            <w:pPr>
-              <w:pStyle w:val="TableText"/>
-            </w:pPr>
-            <w:r>
-              <w:t xml:space="preserve">Unit 3:</w:t>
-            </w:r>
-          </w:p>
-        </w:tc>
-        <w:tc>
-          <w:tcPr>
-            <w:tcW w:w="2506" w:type="dxa"/>
-          </w:tcPr>
-          <w:p>
-            <w:pPr>
-              <w:pStyle w:val="TableText"/>
-            </w:pPr>
-          </w:p>
-        </w:tc>
-        <w:tc>
-          <w:tcPr>
-            <w:tcW w:w="2506" w:type="dxa"/>
-          </w:tcPr>
-          <w:p>
-            <w:pPr>
-              <w:pStyle w:val="TableText"/>
-            </w:pPr>
-          </w:p>
-        </w:tc>
-        <w:tc>
-          <w:tcPr>
-            <w:tcW w:w="2506" w:type="dxa"/>
-          </w:tcPr>
-          <w:p>
-            <w:pPr>
-              <w:pStyle w:val="TableText"/>
-            </w:pPr>
-          </w:p>
-        </w:tc>
-        <w:tc>
-          <w:tcPr>
-            <w:tcW w:w="2506" w:type="dxa"/>
-          </w:tcPr>
-          <w:p>
-            <w:pPr>
-              <w:pStyle w:val="TableText"/>
-            </w:pPr>
-          </w:p>
-        </w:tc>
-        <w:tc>
-          <w:tcPr>
-            <w:tcW w:w="2508" w:type="dxa"/>
-          </w:tcPr>
-          <w:p>
-            <w:pPr>
-              <w:pStyle w:val="TableText"/>
-            </w:pPr>
-          </w:p>
-        </w:tc>
-      </w:tr>
-      <w:tr>
-        <w:trPr>
-          <w:cantSplit/>
-          <w:trHeight w:val="700"/>
-        </w:trPr>
-        <w:tc>
-          <w:tcPr>
-            <w:tcW w:w="2506" w:type="dxa"/>
-          </w:tcPr>
-          <w:p>
-            <w:pPr>
-              <w:pStyle w:val="TableText"/>
-            </w:pPr>
-            <w:r>
-              <w:t xml:space="preserve">Unit 4:</w:t>
-            </w:r>
-          </w:p>
-        </w:tc>
-        <w:tc>
-          <w:tcPr>
-            <w:tcW w:w="2506" w:type="dxa"/>
-          </w:tcPr>
-          <w:p>
-            <w:pPr>
-              <w:pStyle w:val="TableText"/>
-            </w:pPr>
-          </w:p>
-        </w:tc>
-        <w:tc>
-          <w:tcPr>
-            <w:tcW w:w="2506" w:type="dxa"/>
-          </w:tcPr>
-          <w:p>
-            <w:pPr>
-              <w:pStyle w:val="TableText"/>
-            </w:pPr>
-          </w:p>
-        </w:tc>
-        <w:tc>
-          <w:tcPr>
-            <w:tcW w:w="2506" w:type="dxa"/>
-          </w:tcPr>
-          <w:p>
-            <w:pPr>
-              <w:pStyle w:val="TableText"/>
-            </w:pPr>
-          </w:p>
-        </w:tc>
-        <w:tc>
-          <w:tcPr>
-            <w:tcW w:w="2506" w:type="dxa"/>
-          </w:tcPr>
-          <w:p>
-            <w:pPr>
-              <w:pStyle w:val="TableText"/>
-            </w:pPr>
-          </w:p>
-        </w:tc>
-        <w:tc>
-          <w:tcPr>
-            <w:tcW w:w="2508" w:type="dxa"/>
-          </w:tcPr>
-          <w:p>
-            <w:pPr>
-              <w:pStyle w:val="TableText"/>
-            </w:pPr>
-          </w:p>
-        </w:tc>
-      </w:tr>
-      <w:tr>
-        <w:trPr>
-          <w:cantSplit/>
-          <w:trHeight w:val="700"/>
-        </w:trPr>
-        <w:tc>
-          <w:tcPr>
-            <w:tcW w:w="2506" w:type="dxa"/>
-          </w:tcPr>
-          <w:p>
-            <w:pPr>
-              <w:pStyle w:val="TableText"/>
-            </w:pPr>
-            <w:r>
-              <w:t xml:space="preserve">Unit 5:</w:t>
-            </w:r>
-          </w:p>
-        </w:tc>
-        <w:tc>
-          <w:tcPr>
-            <w:tcW w:w="2506" w:type="dxa"/>
-          </w:tcPr>
-          <w:p>
-            <w:pPr>
-              <w:pStyle w:val="TableText"/>
-            </w:pPr>
-          </w:p>
-        </w:tc>
-        <w:tc>
-          <w:tcPr>
-            <w:tcW w:w="2506" w:type="dxa"/>
-          </w:tcPr>
-          <w:p>
-            <w:pPr>
-              <w:pStyle w:val="TableText"/>
-            </w:pPr>
-          </w:p>
-        </w:tc>
-        <w:tc>
-          <w:tcPr>
-            <w:tcW w:w="2506" w:type="dxa"/>
-          </w:tcPr>
-          <w:p>
-            <w:pPr>
-              <w:pStyle w:val="TableText"/>
-            </w:pPr>
-          </w:p>
-        </w:tc>
-        <w:tc>
-          <w:tcPr>
-            <w:tcW w:w="2506" w:type="dxa"/>
-          </w:tcPr>
-          <w:p>
-            <w:pPr>
-              <w:pStyle w:val="TableText"/>
-            </w:pPr>
-          </w:p>
-        </w:tc>
-        <w:tc>
-          <w:tcPr>
-            <w:tcW w:w="2508" w:type="dxa"/>
-          </w:tcPr>
-          <w:p>
-            <w:pPr>
-              <w:pStyle w:val="TableText"/>
-            </w:pPr>
-          </w:p>
-        </w:tc>
-      </w:tr>
-      <w:tr>
-        <w:trPr>
-          <w:cantSplit/>
-          <w:trHeight w:val="700"/>
-        </w:trPr>
-        <w:tc>
-          <w:tcPr>
-            <w:tcW w:w="2506" w:type="dxa"/>
-          </w:tcPr>
-          <w:p>
-            <w:pPr>
-              <w:pStyle w:val="TableText"/>
-            </w:pPr>
-            <w:r>
-              <w:t xml:space="preserve">Unit 6:</w:t>
-            </w:r>
-          </w:p>
-        </w:tc>
-        <w:tc>
-          <w:tcPr>
-            <w:tcW w:w="2506" w:type="dxa"/>
-          </w:tcPr>
-          <w:p>
-            <w:pPr>
-              <w:pStyle w:val="TableText"/>
-            </w:pPr>
-          </w:p>
-        </w:tc>
-        <w:tc>
-          <w:tcPr>
-            <w:tcW w:w="2506" w:type="dxa"/>
-          </w:tcPr>
-          <w:p>
-            <w:pPr>
-              <w:pStyle w:val="TableText"/>
-            </w:pPr>
-          </w:p>
-        </w:tc>
-        <w:tc>
-          <w:tcPr>
-            <w:tcW w:w="2506" w:type="dxa"/>
-          </w:tcPr>
-          <w:p>
-            <w:pPr>
-              <w:pStyle w:val="TableText"/>
-            </w:pPr>
-          </w:p>
-        </w:tc>
-        <w:tc>
-          <w:tcPr>
-            <w:tcW w:w="2506" w:type="dxa"/>
-          </w:tcPr>
-          <w:p>
-            <w:pPr>
-              <w:pStyle w:val="TableText"/>
-            </w:pPr>
-          </w:p>
-        </w:tc>
-        <w:tc>
-          <w:tcPr>
-            <w:tcW w:w="2508" w:type="dxa"/>
-          </w:tcPr>
-          <w:p>
-            <w:pPr>
-              <w:pStyle w:val="TableText"/>
-            </w:pPr>
-          </w:p>
-        </w:tc>
-      </w:tr>
-      <w:tr>
-        <w:trPr>
-          <w:cantSplit/>
-          <w:trHeight w:val="700"/>
-        </w:trPr>
-        <w:tc>
-          <w:tcPr>
-            <w:tcW w:w="2506" w:type="dxa"/>
-          </w:tcPr>
-          <w:p>
-            <w:pPr>
-              <w:pStyle w:val="TableText"/>
-            </w:pPr>
-            <w:r>
-              <w:t xml:space="preserve">Unit 7:</w:t>
-            </w:r>
-          </w:p>
-        </w:tc>
-        <w:tc>
-          <w:tcPr>
-            <w:tcW w:w="2506" w:type="dxa"/>
-          </w:tcPr>
-          <w:p>
-            <w:pPr>
-              <w:pStyle w:val="TableText"/>
-            </w:pPr>
-          </w:p>
-        </w:tc>
-        <w:tc>
-          <w:tcPr>
-            <w:tcW w:w="2506" w:type="dxa"/>
-          </w:tcPr>
-          <w:p>
-            <w:pPr>
-              <w:pStyle w:val="TableText"/>
-            </w:pPr>
-          </w:p>
-        </w:tc>
-        <w:tc>
-          <w:tcPr>
-            <w:tcW w:w="2506" w:type="dxa"/>
-          </w:tcPr>
-          <w:p>
-            <w:pPr>
-              <w:pStyle w:val="TableText"/>
-            </w:pPr>
-          </w:p>
-        </w:tc>
-        <w:tc>
-          <w:tcPr>
-            <w:tcW w:w="2506" w:type="dxa"/>
-          </w:tcPr>
-          <w:p>
-            <w:pPr>
-              <w:pStyle w:val="TableText"/>
-            </w:pPr>
-          </w:p>
-        </w:tc>
-        <w:tc>
-          <w:tcPr>
-            <w:tcW w:w="2508" w:type="dxa"/>
-          </w:tcPr>
-          <w:p>
-            <w:pPr>
-              <w:pStyle w:val="TableText"/>
-            </w:pPr>
-          </w:p>
-        </w:tc>
-      </w:tr>
-      <w:tr>
-        <w:trPr>
-          <w:cantSplit/>
-          <w:trHeight w:val="700"/>
-        </w:trPr>
-        <w:tc>
-          <w:tcPr>
-            <w:tcW w:w="2506" w:type="dxa"/>
-          </w:tcPr>
-          <w:p>
-            <w:pPr>
-              <w:pStyle w:val="TableText"/>
-            </w:pPr>
-            <w:r>
-              <w:t xml:space="preserve">Unit 8:</w:t>
+              <w:t xml:space="preserve">Unit 1: My family and friends</w:t>
+            </w:r>
+          </w:p>
+        </w:tc>
+        <w:tc>
+          <w:tcPr>
+            <w:tcW w:w="2506" w:type="dxa"/>
+          </w:tcPr>
+          <w:p>
+            <w:pPr>
+              <w:pStyle w:val="TableText"/>
+            </w:pPr>
+          </w:p>
+        </w:tc>
+        <w:tc>
+          <w:tcPr>
+            <w:tcW w:w="2506" w:type="dxa"/>
+          </w:tcPr>
+          <w:p>
+            <w:pPr>
+              <w:pStyle w:val="TableText"/>
+            </w:pPr>
+          </w:p>
+        </w:tc>
+        <w:tc>
+          <w:tcPr>
+            <w:tcW w:w="2506" w:type="dxa"/>
+          </w:tcPr>
+          <w:p>
+            <w:pPr>
+              <w:pStyle w:val="TableText"/>
+            </w:pPr>
+          </w:p>
+        </w:tc>
+        <w:tc>
+          <w:tcPr>
+            <w:tcW w:w="2506" w:type="dxa"/>
+          </w:tcPr>
+          <w:p>
+            <w:pPr>
+              <w:pStyle w:val="TableText"/>
+            </w:pPr>
+          </w:p>
+        </w:tc>
+        <w:tc>
+          <w:tcPr>
+            <w:tcW w:w="2508" w:type="dxa"/>
+          </w:tcPr>
+          <w:p>
+            <w:pPr>
+              <w:pStyle w:val="TableText"/>
+            </w:pPr>
+          </w:p>
+        </w:tc>
+      </w:tr>
+      <w:tr>
+        <w:trPr>
+          <w:cantSplit/>
+          <w:trHeight w:val="700"/>
+        </w:trPr>
+        <w:tc>
+          <w:tcPr>
+            <w:tcW w:w="2506" w:type="dxa"/>
+          </w:tcPr>
+          <w:p>
+            <w:pPr>
+              <w:pStyle w:val="TableText"/>
+            </w:pPr>
+            <w:r>
+              <w:t xml:space="preserve">Unit 2: Our beautiful garden</w:t>
+            </w:r>
+          </w:p>
+        </w:tc>
+        <w:tc>
+          <w:tcPr>
+            <w:tcW w:w="2506" w:type="dxa"/>
+          </w:tcPr>
+          <w:p>
+            <w:pPr>
+              <w:pStyle w:val="TableText"/>
+            </w:pPr>
+          </w:p>
+        </w:tc>
+        <w:tc>
+          <w:tcPr>
+            <w:tcW w:w="2506" w:type="dxa"/>
+          </w:tcPr>
+          <w:p>
+            <w:pPr>
+              <w:pStyle w:val="TableText"/>
+            </w:pPr>
+          </w:p>
+        </w:tc>
+        <w:tc>
+          <w:tcPr>
+            <w:tcW w:w="2506" w:type="dxa"/>
+          </w:tcPr>
+          <w:p>
+            <w:pPr>
+              <w:pStyle w:val="TableText"/>
+            </w:pPr>
+          </w:p>
+        </w:tc>
+        <w:tc>
+          <w:tcPr>
+            <w:tcW w:w="2506" w:type="dxa"/>
+          </w:tcPr>
+          <w:p>
+            <w:pPr>
+              <w:pStyle w:val="TableText"/>
+            </w:pPr>
+          </w:p>
+        </w:tc>
+        <w:tc>
+          <w:tcPr>
+            <w:tcW w:w="2508" w:type="dxa"/>
+          </w:tcPr>
+          <w:p>
+            <w:pPr>
+              <w:pStyle w:val="TableText"/>
+            </w:pPr>
+          </w:p>
+        </w:tc>
+      </w:tr>
+      <w:tr>
+        <w:trPr>
+          <w:cantSplit/>
+          <w:trHeight w:val="700"/>
+        </w:trPr>
+        <w:tc>
+          <w:tcPr>
+            <w:tcW w:w="2506" w:type="dxa"/>
+          </w:tcPr>
+          <w:p>
+            <w:pPr>
+              <w:pStyle w:val="TableText"/>
+            </w:pPr>
+            <w:r>
+              <w:t xml:space="preserve">Unit 3: Places around me</w:t>
+            </w:r>
+          </w:p>
+        </w:tc>
+        <w:tc>
+          <w:tcPr>
+            <w:tcW w:w="2506" w:type="dxa"/>
+          </w:tcPr>
+          <w:p>
+            <w:pPr>
+              <w:pStyle w:val="TableText"/>
+            </w:pPr>
+          </w:p>
+        </w:tc>
+        <w:tc>
+          <w:tcPr>
+            <w:tcW w:w="2506" w:type="dxa"/>
+          </w:tcPr>
+          <w:p>
+            <w:pPr>
+              <w:pStyle w:val="TableText"/>
+            </w:pPr>
+          </w:p>
+        </w:tc>
+        <w:tc>
+          <w:tcPr>
+            <w:tcW w:w="2506" w:type="dxa"/>
+          </w:tcPr>
+          <w:p>
+            <w:pPr>
+              <w:pStyle w:val="TableText"/>
+            </w:pPr>
+          </w:p>
+        </w:tc>
+        <w:tc>
+          <w:tcPr>
+            <w:tcW w:w="2506" w:type="dxa"/>
+          </w:tcPr>
+          <w:p>
+            <w:pPr>
+              <w:pStyle w:val="TableText"/>
+            </w:pPr>
+          </w:p>
+        </w:tc>
+        <w:tc>
+          <w:tcPr>
+            <w:tcW w:w="2508" w:type="dxa"/>
+          </w:tcPr>
+          <w:p>
+            <w:pPr>
+              <w:pStyle w:val="TableText"/>
+            </w:pPr>
+          </w:p>
+        </w:tc>
+      </w:tr>
+      <w:tr>
+        <w:trPr>
+          <w:cantSplit/>
+          <w:trHeight w:val="700"/>
+        </w:trPr>
+        <w:tc>
+          <w:tcPr>
+            <w:tcW w:w="2506" w:type="dxa"/>
+          </w:tcPr>
+          <w:p>
+            <w:pPr>
+              <w:pStyle w:val="TableText"/>
+            </w:pPr>
+            <w:r>
+              <w:t xml:space="preserve">Unit 4: Joy of work</w:t>
+            </w:r>
+          </w:p>
+        </w:tc>
+        <w:tc>
+          <w:tcPr>
+            <w:tcW w:w="2506" w:type="dxa"/>
+          </w:tcPr>
+          <w:p>
+            <w:pPr>
+              <w:pStyle w:val="TableText"/>
+            </w:pPr>
+          </w:p>
+        </w:tc>
+        <w:tc>
+          <w:tcPr>
+            <w:tcW w:w="2506" w:type="dxa"/>
+          </w:tcPr>
+          <w:p>
+            <w:pPr>
+              <w:pStyle w:val="TableText"/>
+            </w:pPr>
+          </w:p>
+        </w:tc>
+        <w:tc>
+          <w:tcPr>
+            <w:tcW w:w="2506" w:type="dxa"/>
+          </w:tcPr>
+          <w:p>
+            <w:pPr>
+              <w:pStyle w:val="TableText"/>
+            </w:pPr>
+          </w:p>
+        </w:tc>
+        <w:tc>
+          <w:tcPr>
+            <w:tcW w:w="2506" w:type="dxa"/>
+          </w:tcPr>
+          <w:p>
+            <w:pPr>
+              <w:pStyle w:val="TableText"/>
+            </w:pPr>
+          </w:p>
+        </w:tc>
+        <w:tc>
+          <w:tcPr>
+            <w:tcW w:w="2508" w:type="dxa"/>
+          </w:tcPr>
+          <w:p>
+            <w:pPr>
+              <w:pStyle w:val="TableText"/>
+            </w:pPr>
+          </w:p>
+        </w:tc>
+      </w:tr>
+      <w:tr>
+        <w:trPr>
+          <w:cantSplit/>
+          <w:trHeight w:val="700"/>
+        </w:trPr>
+        <w:tc>
+          <w:tcPr>
+            <w:tcW w:w="2506" w:type="dxa"/>
+          </w:tcPr>
+          <w:p>
+            <w:pPr>
+              <w:pStyle w:val="TableText"/>
+            </w:pPr>
+            <w:r>
+              <w:t xml:space="preserve">Unit 5: Our festivals</w:t>
+            </w:r>
+          </w:p>
+        </w:tc>
+        <w:tc>
+          <w:tcPr>
+            <w:tcW w:w="2506" w:type="dxa"/>
+          </w:tcPr>
+          <w:p>
+            <w:pPr>
+              <w:pStyle w:val="TableText"/>
+            </w:pPr>
+          </w:p>
+        </w:tc>
+        <w:tc>
+          <w:tcPr>
+            <w:tcW w:w="2506" w:type="dxa"/>
+          </w:tcPr>
+          <w:p>
+            <w:pPr>
+              <w:pStyle w:val="TableText"/>
+            </w:pPr>
+          </w:p>
+        </w:tc>
+        <w:tc>
+          <w:tcPr>
+            <w:tcW w:w="2506" w:type="dxa"/>
+          </w:tcPr>
+          <w:p>
+            <w:pPr>
+              <w:pStyle w:val="TableText"/>
+            </w:pPr>
+          </w:p>
+        </w:tc>
+        <w:tc>
+          <w:tcPr>
+            <w:tcW w:w="2506" w:type="dxa"/>
+          </w:tcPr>
+          <w:p>
+            <w:pPr>
+              <w:pStyle w:val="TableText"/>
+            </w:pPr>
+          </w:p>
+        </w:tc>
+        <w:tc>
+          <w:tcPr>
+            <w:tcW w:w="2508" w:type="dxa"/>
+          </w:tcPr>
+          <w:p>
+            <w:pPr>
+              <w:pStyle w:val="TableText"/>
+            </w:pPr>
+          </w:p>
+        </w:tc>
+      </w:tr>
+      <w:tr>
+        <w:trPr>
+          <w:cantSplit/>
+          <w:trHeight w:val="700"/>
+        </w:trPr>
+        <w:tc>
+          <w:tcPr>
+            <w:tcW w:w="2506" w:type="dxa"/>
+          </w:tcPr>
+          <w:p>
+            <w:pPr>
+              <w:pStyle w:val="TableText"/>
+            </w:pPr>
+            <w:r>
+              <w:t xml:space="preserve">Unit 6: Let's go shopping</w:t>
+            </w:r>
+          </w:p>
+        </w:tc>
+        <w:tc>
+          <w:tcPr>
+            <w:tcW w:w="2506" w:type="dxa"/>
+          </w:tcPr>
+          <w:p>
+            <w:pPr>
+              <w:pStyle w:val="TableText"/>
+            </w:pPr>
+          </w:p>
+        </w:tc>
+        <w:tc>
+          <w:tcPr>
+            <w:tcW w:w="2506" w:type="dxa"/>
+          </w:tcPr>
+          <w:p>
+            <w:pPr>
+              <w:pStyle w:val="TableText"/>
+            </w:pPr>
+          </w:p>
+        </w:tc>
+        <w:tc>
+          <w:tcPr>
+            <w:tcW w:w="2506" w:type="dxa"/>
+          </w:tcPr>
+          <w:p>
+            <w:pPr>
+              <w:pStyle w:val="TableText"/>
+            </w:pPr>
+          </w:p>
+        </w:tc>
+        <w:tc>
+          <w:tcPr>
+            <w:tcW w:w="2506" w:type="dxa"/>
+          </w:tcPr>
+          <w:p>
+            <w:pPr>
+              <w:pStyle w:val="TableText"/>
+            </w:pPr>
+          </w:p>
+        </w:tc>
+        <w:tc>
+          <w:tcPr>
+            <w:tcW w:w="2508" w:type="dxa"/>
+          </w:tcPr>
+          <w:p>
+            <w:pPr>
+              <w:pStyle w:val="TableText"/>
+            </w:pPr>
+          </w:p>
+        </w:tc>
+      </w:tr>
+      <w:tr>
+        <w:trPr>
+          <w:cantSplit/>
+          <w:trHeight w:val="700"/>
+        </w:trPr>
+        <w:tc>
+          <w:tcPr>
+            <w:tcW w:w="2506" w:type="dxa"/>
+          </w:tcPr>
+          <w:p>
+            <w:pPr>
+              <w:pStyle w:val="TableText"/>
+            </w:pPr>
+            <w:r>
+              <w:t xml:space="preserve">Unit 7: My calendar</w:t>
+            </w:r>
+          </w:p>
+        </w:tc>
+        <w:tc>
+          <w:tcPr>
+            <w:tcW w:w="2506" w:type="dxa"/>
+          </w:tcPr>
+          <w:p>
+            <w:pPr>
+              <w:pStyle w:val="TableText"/>
+            </w:pPr>
+          </w:p>
+        </w:tc>
+        <w:tc>
+          <w:tcPr>
+            <w:tcW w:w="2506" w:type="dxa"/>
+          </w:tcPr>
+          <w:p>
+            <w:pPr>
+              <w:pStyle w:val="TableText"/>
+            </w:pPr>
+          </w:p>
+        </w:tc>
+        <w:tc>
+          <w:tcPr>
+            <w:tcW w:w="2506" w:type="dxa"/>
+          </w:tcPr>
+          <w:p>
+            <w:pPr>
+              <w:pStyle w:val="TableText"/>
+            </w:pPr>
+          </w:p>
+        </w:tc>
+        <w:tc>
+          <w:tcPr>
+            <w:tcW w:w="2506" w:type="dxa"/>
+          </w:tcPr>
+          <w:p>
+            <w:pPr>
+              <w:pStyle w:val="TableText"/>
+            </w:pPr>
+          </w:p>
+        </w:tc>
+        <w:tc>
+          <w:tcPr>
+            <w:tcW w:w="2508" w:type="dxa"/>
+          </w:tcPr>
+          <w:p>
+            <w:pPr>
+              <w:pStyle w:val="TableText"/>
+            </w:pPr>
+          </w:p>
+        </w:tc>
+      </w:tr>
+      <w:tr>
+        <w:trPr>
+          <w:cantSplit/>
+          <w:trHeight w:val="700"/>
+        </w:trPr>
+        <w:tc>
+          <w:tcPr>
+            <w:tcW w:w="2506" w:type="dxa"/>
+          </w:tcPr>
+          <w:p>
+            <w:pPr>
+              <w:pStyle w:val="TableText"/>
+            </w:pPr>
+            <w:r>
+              <w:t xml:space="preserve">Unit 8: Playing games</w:t>
+            </w:r>
+          </w:p>
+        </w:tc>
+        <w:tc>
+          <w:tcPr>
+            <w:tcW w:w="2506" w:type="dxa"/>
+          </w:tcPr>
+          <w:p>
+            <w:pPr>
+              <w:pStyle w:val="TableText"/>
+            </w:pPr>
+          </w:p>
+        </w:tc>
+        <w:tc>
+          <w:tcPr>
+            <w:tcW w:w="2506" w:type="dxa"/>
+          </w:tcPr>
+          <w:p>
+            <w:pPr>
+              <w:pStyle w:val="TableText"/>
+            </w:pPr>
+          </w:p>
+        </w:tc>
+        <w:tc>
+          <w:tcPr>
+            <w:tcW w:w="2506" w:type="dxa"/>
+          </w:tcPr>
+          <w:p>
+            <w:pPr>
+              <w:pStyle w:val="TableText"/>
+            </w:pPr>
+          </w:p>
+        </w:tc>
+        <w:tc>
+          <w:tcPr>
+            <w:tcW w:w="2506" w:type="dxa"/>
+          </w:tcPr>
+          <w:p>
+            <w:pPr>
+              <w:pStyle w:val="TableText"/>
+            </w:pPr>
+          </w:p>
+        </w:tc>
+        <w:tc>
+          <w:tcPr>
+            <w:tcW w:w="2508" w:type="dxa"/>
+          </w:tcPr>
+          <w:p>
+            <w:pPr>
+              <w:pStyle w:val="TableText"/>
+            </w:pPr>
+          </w:p>
+        </w:tc>
+      </w:tr>
+      <w:tr>
+        <w:trPr>
+          <w:cantSplit/>
+          <w:trHeight w:val="700"/>
+        </w:trPr>
+        <w:tc>
+          <w:tcPr>
+            <w:tcW w:w="2506" w:type="dxa"/>
+          </w:tcPr>
+          <w:p>
+            <w:pPr>
+              <w:pStyle w:val="TableText"/>
+            </w:pPr>
+            <w:r>
+              <w:t xml:space="preserve">Unit 9: Good practices</w:t>
+            </w:r>
+          </w:p>
+        </w:tc>
+        <w:tc>
+          <w:tcPr>
+            <w:tcW w:w="2506" w:type="dxa"/>
+          </w:tcPr>
+          <w:p>
+            <w:pPr>
+              <w:pStyle w:val="TableText"/>
+            </w:pPr>
+          </w:p>
+        </w:tc>
+        <w:tc>
+          <w:tcPr>
+            <w:tcW w:w="2506" w:type="dxa"/>
+          </w:tcPr>
+          <w:p>
+            <w:pPr>
+              <w:pStyle w:val="TableText"/>
+            </w:pPr>
+          </w:p>
+        </w:tc>
+        <w:tc>
+          <w:tcPr>
+            <w:tcW w:w="2506" w:type="dxa"/>
+          </w:tcPr>
+          <w:p>
+            <w:pPr>
+              <w:pStyle w:val="TableText"/>
+            </w:pPr>
+          </w:p>
+        </w:tc>
+        <w:tc>
+          <w:tcPr>
+            <w:tcW w:w="2506" w:type="dxa"/>
+          </w:tcPr>
+          <w:p>
+            <w:pPr>
+              <w:pStyle w:val="TableText"/>
+            </w:pPr>
+          </w:p>
+        </w:tc>
+        <w:tc>
+          <w:tcPr>
+            <w:tcW w:w="2508" w:type="dxa"/>
+          </w:tcPr>
+          <w:p>
+            <w:pPr>
+              <w:pStyle w:val="TableText"/>
+            </w:pPr>
+          </w:p>
+        </w:tc>
+      </w:tr>
+      <w:tr>
+        <w:trPr>
+          <w:cantSplit/>
+          <w:trHeight w:val="700"/>
+        </w:trPr>
+        <w:tc>
+          <w:tcPr>
+            <w:tcW w:w="2506" w:type="dxa"/>
+          </w:tcPr>
+          <w:p>
+            <w:pPr>
+              <w:pStyle w:val="TableText"/>
+            </w:pPr>
+            <w:r>
+              <w:t xml:space="preserve">Unit 10: Happy days</w:t>
             </w:r>
           </w:p>
         </w:tc>

</xml_diff>